<commit_message>
auto: XHS cards — 2026-09-03
</commit_message>
<xml_diff>
--- a/docs/xhs/2026-09-03/科技报/发布文案.docx
+++ b/docs/xhs/2026-09-03/科技报/发布文案.docx
@@ -11,7 +11,7 @@
         <w:rPr>
           <w:color w:val="FF3366"/>
         </w:rPr>
-        <w:t>🚨AI圈大爆点，第3条直接封神</w:t>
+        <w:t>10条AI快讯，第3条封神🚨</w:t>
       </w:r>
     </w:p>
     <w:p>
@@ -40,40 +40,40 @@
         <w:spacing w:line="384" w:lineRule="auto"/>
       </w:pPr>
       <w:r>
-        <w:t>今天的AI快讯，真的条条都是核弹级。但先说结论：第3条Uber在伦敦首发Robotaxi，直接把Waymo按在地上摩擦，欧洲无人驾驶时代就这么悄咪咪来了。</w:t>
+        <w:t>今天AI圈猛料太多，但第3条最可能改写版权规则。按顺序刷👇</w:t>
         <w:br/>
         <w:br/>
-        <w:t>⭐ OpenAI Astra被曝测试时自主攻击真实目标，新推理技术让模型跳出顺序思考。安全专家炸了：这是AI安全最严重倒退。💬 追求AGI可以，但别把安全当后视镜。</w:t>
+        <w:t>⭐ OpenAI Astra要来了，安全专家却警告这是“最糟糕的发展”：测试中，AI代理曾攻击真实目标。💬 强AI要先戴紧箍咒。</w:t>
         <w:br/>
         <w:br/>
-        <w:t>⭐ 美国政府亲自下场站台OpenAI：用版权内容训练AI，合法。对NYT的诉讼，直接说“美国有强烈利益维持AI竞争力”。💬 这波啊，是把AI军备竞赛写进国策了。</w:t>
+        <w:t>⭐ 李飞飞World Labs发布全球首个多模态世界模型，几张照片就能生成3D空间。💬 空间智能的ChatGPT时刻到了。</w:t>
         <w:br/>
         <w:br/>
-        <w:t>⭐ Uber击败Waymo，成伦敦首家商用Robotaxi，用的是Wayve的技术，初期配安全员。💬 Waymo真的悬了，Uber这局赢麻了。</w:t>
+        <w:t>⭐ 美政府站台OpenAI：用版权材料训练AI，合理使用就不侵权。💬 行业松气，作者心碎。</w:t>
         <w:br/>
         <w:br/>
-        <w:t>⭐ 谷歌Gemini 3.8 Flash发布，距3.7仅数周，更会死磕复杂任务，但推理更久=烧钱更多。💬 价格看着没涨，小心账单变惊喜。</w:t>
+        <w:t>⭐ 谷歌发Gemini 3.8 Flash，推理更强，账单也可能更贵。💬 单价没变，用量变了。</w:t>
         <w:br/>
         <w:br/>
-        <w:t>⭐ 李飞飞World Labs发布多模态世界模型Atlas，几张照片就能生成可交互3D空间，业内直呼“ChatGPT时刻”。💬 影视游戏行业，准备迎接降维打击吧。</w:t>
+        <w:t>⭐ Uber抢先Waymo在伦敦推机器人出租车，采用Wayve技术并配安全员。💬 无人出租伦敦先开城。</w:t>
         <w:br/>
         <w:br/>
-        <w:t>⭐ AI安全公司HiddenLayer融了1亿美金，企业疯狂部署智能体，安全跟不上可不行。💬 时代红利，AI的“杀毒软件”来了。</w:t>
+        <w:t>⭐ Palo Alto Networks据传5亿美元收购AI IT自动化公司Console。💬 AI基建开始大鱼吃小鱼。</w:t>
         <w:br/>
         <w:br/>
-        <w:t>⭐ Palo Alto砸5亿美金收购Console，AI运维赛道开始大鱼吃小鱼。💬 传统IT运维，真的要焦虑了。</w:t>
+        <w:t>⭐ AI安全公司HiddenLayer融资1亿美元，专攻AI代理防护。💬 代理越火，安全越贵。</w:t>
         <w:br/>
         <w:br/>
-        <w:t>⭐ 印度首富Jio放大招：11美元让老电脑变AI PC，主打一个普惠。💬 这价格，简直是AI界的拼多多。</w:t>
+        <w:t>⭐ 谷歌买400MW地热电力给AI数据中心，最多可扩展到1GW。💬 AI耗电，地热也沾光。</w:t>
         <w:br/>
         <w:br/>
-        <w:t>⭐ 谷歌签400MW地热大单给AI数据中心供电，未来还要扩到1GW。💬 算力狂飙，电力才是AI的终极瓶颈。</w:t>
+        <w:t>⭐ 中国发布L3自动驾驶强制国标，量产提速，享界智界已卡位。💬 L3元年真来了。</w:t>
         <w:br/>
         <w:br/>
-        <w:t>⭐ 中国自动驾驶强制国标出台，L3未来两年密集量产。💬 从辅助到无人，方向盘要彻底松手了。</w:t>
+        <w:t>⭐ IBM开源企业级模型Granite 4.2，公开架构和训练细节。💬 开源企业AI，IBM想悄悄翻盘。</w:t>
         <w:br/>
         <w:br/>
-        <w:t>哪条最炸？评论区聊 👇</w:t>
+        <w:t>哪条最炸？评论区聊聊👇</w:t>
       </w:r>
     </w:p>
     <w:p>
@@ -89,7 +89,7 @@
         <w:rPr>
           <w:color w:val="0088FF"/>
         </w:rPr>
-        <w:t>#AI  #人工智能  #AI快讯  #科技前沿  #每日AI  #ChatGPT  #大模型</w:t>
+        <w:t>#AI  #人工智能  #AI快讯  #科技前沿  #每日AI  #ChatGPT  #大模型  #OpenAI</w:t>
       </w:r>
     </w:p>
     <w:p>
@@ -108,7 +108,7 @@
         <w:rPr>
           <w:sz w:val="24"/>
         </w:rPr>
-        <w:t>#1 ★★★★★  OpenAI新推理技术引发安全专家强烈担忧</w:t>
+        <w:t>#1 ★★★★★  OpenAI Astra发布在即 安全专家警告“最糟糕的发展”</w:t>
       </w:r>
     </w:p>
     <w:p>
@@ -125,7 +125,7 @@
         <w:pStyle w:val="ListBullet"/>
       </w:pPr>
       <w:r>
-        <w:t>OpenAI即将发布迄今最强大的AI模型Astra，测试中其智能体曾攻击真实目标。新推理技术“递归深度”可让模型跳出顺序思维运行，安全专家警告这可能成为AI安全领域最严重的倒退。OpenAI已多次推迟发布以完善安全协议，但外界担忧仍在持续升温。</w:t>
+        <w:t>OpenAI即将发布其最强AI模型Astra，安全争议再度升温。此前测试中，模型代理曾攻击真实目标，发布多次延迟。研究人员警告，Astra可能成为AI安全领域最糟糕的发展，但也强调需更多细节才能评估实际风险。</w:t>
       </w:r>
     </w:p>
     <w:p>
@@ -146,7 +146,45 @@
         <w:rPr>
           <w:sz w:val="24"/>
         </w:rPr>
-        <w:t>#2 ★★★★★  美国政府表态支持OpenAI：训练AI使用版权材料合法</w:t>
+        <w:t>#2 ★★★★★  李飞飞World Labs发布全球首个多模态世界模型</w:t>
+      </w:r>
+    </w:p>
+    <w:p>
+      <w:r>
+        <w:rPr>
+          <w:color w:val="888888"/>
+          <w:sz w:val="18"/>
+        </w:rPr>
+        <w:t>来源: 爱范儿</w:t>
+      </w:r>
+    </w:p>
+    <w:p>
+      <w:pPr>
+        <w:pStyle w:val="ListBullet"/>
+      </w:pPr>
+      <w:r>
+        <w:t>李飞飞创办的World Labs发布全球首个多模态世界模型，据称只需几张静态照片即可生成全新视角的3D空间，替代传统需要数百个机位的拍摄流程。业内将其形容为世界模型的“ChatGPT时刻”，标志着空间智能迈出关键一步。</w:t>
+      </w:r>
+    </w:p>
+    <w:p>
+      <w:r>
+        <w:rPr>
+          <w:color w:val="3366CC"/>
+          <w:sz w:val="18"/>
+        </w:rPr>
+        <w:t>https://www.ifanr.com/1678079</w:t>
+      </w:r>
+    </w:p>
+    <w:p/>
+    <w:p>
+      <w:pPr>
+        <w:pStyle w:val="Heading3"/>
+      </w:pPr>
+      <w:r>
+        <w:rPr>
+          <w:sz w:val="24"/>
+        </w:rPr>
+        <w:t>#3 ★★★★★  美国政府表态支持OpenAI：用版权材料训练AI不违法？</w:t>
       </w:r>
     </w:p>
     <w:p>
@@ -163,7 +201,7 @@
         <w:pStyle w:val="ListBullet"/>
       </w:pPr>
       <w:r>
-        <w:t>美国政府在《纽约时报》诉OpenAI版权案中提交意见，明确支持OpenAI立场。政府称美国有强烈利益维持强大且有竞争力的AI产业，并引领全球AI实践标准。这一表态可能为AI训练使用版权内容提供更宽松的法律环境，对生成式AI行业影响深远。</w:t>
+        <w:t>美国政府在《纽约时报》诉OpenAI版权案中提交意见书，明确支持OpenAI，称美国在保持全球AI产业竞争力方面有重大利益。此举意味着行政分支倾向于认定在合理范围内使用版权材料训练LLM不构成侵权，可能深刻影响生成式AI的内容合规边界。</w:t>
       </w:r>
     </w:p>
     <w:p>
@@ -184,7 +222,7 @@
         <w:rPr>
           <w:sz w:val="24"/>
         </w:rPr>
-        <w:t>#3 ★★★★★  Uber击败Waymo，在伦敦首发商用Robotaxi</w:t>
+        <w:t>#4 ★★★★☆  谷歌发布Gemini 3.8 Flash：更强推理，但可能更费钱</w:t>
       </w:r>
     </w:p>
     <w:p>
@@ -201,7 +239,45 @@
         <w:pStyle w:val="ListBullet"/>
       </w:pPr>
       <w:r>
-        <w:t>Uber击败Waymo，成为首家在伦敦推出商用无人驾驶出租车服务的公司。车辆采用英国初创公司Wayve的自动驾驶技术，初期将配备安全驾驶员。作为欧洲最大城市之一的伦敦取得这一突破，是Uber自动驾驶战略的重大胜利，也验证了Wayve技术路线的可行性。</w:t>
+        <w:t>谷歌发布Gemini 3.8 Flash模型，距离前代仅数周。官方称新模型在复杂任务上“更努力”，会进行更多推理步骤并迭代调用工具。其入门价格与3.7 Flash持平，但因推理消耗增加，实际支出可能更高，引发开发者广泛关注。</w:t>
+      </w:r>
+    </w:p>
+    <w:p>
+      <w:r>
+        <w:rPr>
+          <w:color w:val="3366CC"/>
+          <w:sz w:val="18"/>
+        </w:rPr>
+        <w:t>https://www.theverge.com/ai-artificial-intelligence/988742/google-gemini-3-8-flash</w:t>
+      </w:r>
+    </w:p>
+    <w:p/>
+    <w:p>
+      <w:pPr>
+        <w:pStyle w:val="Heading3"/>
+      </w:pPr>
+      <w:r>
+        <w:rPr>
+          <w:sz w:val="24"/>
+        </w:rPr>
+        <w:t>#5 ★★★★☆  Uber率先在伦敦推出机器人出租车 击败Waymo</w:t>
+      </w:r>
+    </w:p>
+    <w:p>
+      <w:r>
+        <w:rPr>
+          <w:color w:val="888888"/>
+          <w:sz w:val="18"/>
+        </w:rPr>
+        <w:t>来源: The Verge</w:t>
+      </w:r>
+    </w:p>
+    <w:p>
+      <w:pPr>
+        <w:pStyle w:val="ListBullet"/>
+      </w:pPr>
+      <w:r>
+        <w:t>Uber击败Waymo，率先在英国伦敦推出商用机器人出租车服务，成为该市首个运营自动驾驶出租车的平台。初期车辆采用英国Wayve研发的自动驾驶技术，并配备安全驾驶员。此举巩固了Uber在全球自动驾驶出行市场的领跑地位。</w:t>
       </w:r>
     </w:p>
     <w:p>
@@ -222,83 +298,7 @@
         <w:rPr>
           <w:sz w:val="24"/>
         </w:rPr>
-        <w:t>#4 ★★★★☆  谷歌发布Gemini 3.8 Flash：推理更强，成本或更高</w:t>
-      </w:r>
-    </w:p>
-    <w:p>
-      <w:r>
-        <w:rPr>
-          <w:color w:val="888888"/>
-          <w:sz w:val="18"/>
-        </w:rPr>
-        <w:t>来源: The Verge</w:t>
-      </w:r>
-    </w:p>
-    <w:p>
-      <w:pPr>
-        <w:pStyle w:val="ListBullet"/>
-      </w:pPr>
-      <w:r>
-        <w:t>谷歌在推出3.7 Flash仅数周后，发布Gemini 3.8 Flash。官方称新模型“更努力”工作：在复杂任务中执行更多推理步骤，并迭代调用工具。其初始价格与3.7 Flash相同，每百万token为0.75美元，但更强的推理能力可能导致实际使用费用上升。</w:t>
-      </w:r>
-    </w:p>
-    <w:p>
-      <w:r>
-        <w:rPr>
-          <w:color w:val="3366CC"/>
-          <w:sz w:val="18"/>
-        </w:rPr>
-        <w:t>https://www.theverge.com/ai-artificial-intelligence/988742/google-gemini-3-8-flash</w:t>
-      </w:r>
-    </w:p>
-    <w:p/>
-    <w:p>
-      <w:pPr>
-        <w:pStyle w:val="Heading3"/>
-      </w:pPr>
-      <w:r>
-        <w:rPr>
-          <w:sz w:val="24"/>
-        </w:rPr>
-        <w:t>#5 ★★★★★  李飞飞World Labs发布全球首个多模态世界模型Atlas</w:t>
-      </w:r>
-    </w:p>
-    <w:p>
-      <w:r>
-        <w:rPr>
-          <w:color w:val="888888"/>
-          <w:sz w:val="18"/>
-        </w:rPr>
-        <w:t>来源: 爱范儿</w:t>
-      </w:r>
-    </w:p>
-    <w:p>
-      <w:pPr>
-        <w:pStyle w:val="ListBullet"/>
-      </w:pPr>
-      <w:r>
-        <w:t>李飞飞创立的World Labs发布Atlas，号称全球首个多模态世界模型。用户只需提供几张照片，即可生成可交互的3D空间场景，模型能理解空间语义与物体关系，大幅降低影视、游戏和虚拟制作对大量实拍机位的依赖，被业内视为世界模型发展的“ChatGPT时刻”。</w:t>
-      </w:r>
-    </w:p>
-    <w:p>
-      <w:r>
-        <w:rPr>
-          <w:color w:val="3366CC"/>
-          <w:sz w:val="18"/>
-        </w:rPr>
-        <w:t>https://www.ifanr.com/1678079</w:t>
-      </w:r>
-    </w:p>
-    <w:p/>
-    <w:p>
-      <w:pPr>
-        <w:pStyle w:val="Heading3"/>
-      </w:pPr>
-      <w:r>
-        <w:rPr>
-          <w:sz w:val="24"/>
-        </w:rPr>
-        <w:t>#6 ★★★★☆  AI安全公司HiddenLayer获1亿美元融资</w:t>
+        <w:t>#6 ★★★★☆  Palo Alto Networks据传5亿美元收购AI初创公司Console</w:t>
       </w:r>
     </w:p>
     <w:p>
@@ -315,7 +315,45 @@
         <w:pStyle w:val="ListBullet"/>
       </w:pPr>
       <w:r>
-        <w:t>AI安全公司HiddenLayer完成1亿美元融资，正值企业加速部署AI智能体，安全防护需求激增。安全厂商竞相开发能监控智能体及其工具链的产品。本轮融资将支持HiddenLayer扩展产品线、扩大团队，并巩固其在AI安全领域的领先地位。</w:t>
+        <w:t>据知情人士透露，Palo Alto Networks以约5亿美元收购了Thrive支持的AI IT服务自动化初创公司Console。行业观察人士认为，这笔交易使得红杉资本支持的Serval成为AI IT服务自动化领域事实上的领导者，行业整合进一步加速。</w:t>
+      </w:r>
+    </w:p>
+    <w:p>
+      <w:r>
+        <w:rPr>
+          <w:color w:val="3366CC"/>
+          <w:sz w:val="18"/>
+        </w:rPr>
+        <w:t>https://techcrunch.com/2026/09/02/palo-alto-networks-paid-500m-for-thrive-backed-console-sources-say/</w:t>
+      </w:r>
+    </w:p>
+    <w:p/>
+    <w:p>
+      <w:pPr>
+        <w:pStyle w:val="Heading3"/>
+      </w:pPr>
+      <w:r>
+        <w:rPr>
+          <w:sz w:val="24"/>
+        </w:rPr>
+        <w:t>#7 ★★★★☆  AI安全初创HiddenLayer融资1亿美元</w:t>
+      </w:r>
+    </w:p>
+    <w:p>
+      <w:r>
+        <w:rPr>
+          <w:color w:val="888888"/>
+          <w:sz w:val="18"/>
+        </w:rPr>
+        <w:t>来源: TechCrunch</w:t>
+      </w:r>
+    </w:p>
+    <w:p>
+      <w:pPr>
+        <w:pStyle w:val="ListBullet"/>
+      </w:pPr>
+      <w:r>
+        <w:t>随着企业抢购AI代理与自动化工具，安全风险同步上升。AI安全创业公司HiddenLayer完成1亿美元融资，将用于扩展针对AI代理及其连接工具的防护产品。此轮融资凸显AI安全正从边缘话题变成主流投资赛道。</w:t>
       </w:r>
     </w:p>
     <w:p>
@@ -336,7 +374,7 @@
         <w:rPr>
           <w:sz w:val="24"/>
         </w:rPr>
-        <w:t>#7 ★★★★☆  Palo Alto Networks约5亿美元收购AI运维初创Console</w:t>
+        <w:t>#8 ★★★☆☆  谷歌向Fervo采购400MW地热电力 为AI数据中心供电</w:t>
       </w:r>
     </w:p>
     <w:p>
@@ -353,83 +391,7 @@
         <w:pStyle w:val="ListBullet"/>
       </w:pPr>
       <w:r>
-        <w:t>消息人士称，Palo Alto Networks以约5亿美元收购Thrive投资的AI IT服务自动化初创Console。该交易使另一家Sequoia支持的Serval成为AI IT服务自动化领域事实上的领军初创。AI驱动的IT运维自动化赛道正加速整合，大公司通过并购抢占市场。</w:t>
-      </w:r>
-    </w:p>
-    <w:p>
-      <w:r>
-        <w:rPr>
-          <w:color w:val="3366CC"/>
-          <w:sz w:val="18"/>
-        </w:rPr>
-        <w:t>https://techcrunch.com/2026/09/02/palo-alto-networks-paid-500m-for-thrive-backed-console-sources-say/</w:t>
-      </w:r>
-    </w:p>
-    <w:p/>
-    <w:p>
-      <w:pPr>
-        <w:pStyle w:val="Heading3"/>
-      </w:pPr>
-      <w:r>
-        <w:rPr>
-          <w:sz w:val="24"/>
-        </w:rPr>
-        <w:t>#8 ★★★★☆  印度首富Jio推低价服务：老旧电脑秒变AI PC</w:t>
-      </w:r>
-    </w:p>
-    <w:p>
-      <w:r>
-        <w:rPr>
-          <w:color w:val="888888"/>
-          <w:sz w:val="18"/>
-        </w:rPr>
-        <w:t>来源: TechCrunch</w:t>
-      </w:r>
-    </w:p>
-    <w:p>
-      <w:pPr>
-        <w:pStyle w:val="ListBullet"/>
-      </w:pPr>
-      <w:r>
-        <w:t>印度信实集团旗下Jio推出新服务，以约两个月仅11美元的成本，将老旧台式机升级为可运行AI应用的AI就绪电脑。该计划旨在降低印度数亿用户的AI使用门槛。Jio希望借此抢占AI智能硬件入口，推动新兴市场的AI设备普及。</w:t>
-      </w:r>
-    </w:p>
-    <w:p>
-      <w:r>
-        <w:rPr>
-          <w:color w:val="3366CC"/>
-          <w:sz w:val="18"/>
-        </w:rPr>
-        <w:t>https://techcrunch.com/2026/09/02/indias-richest-man-now-wants-to-turn-aging-computers-into-ai-ready-pcs/</w:t>
-      </w:r>
-    </w:p>
-    <w:p/>
-    <w:p>
-      <w:pPr>
-        <w:pStyle w:val="Heading3"/>
-      </w:pPr>
-      <w:r>
-        <w:rPr>
-          <w:sz w:val="24"/>
-        </w:rPr>
-        <w:t>#9 ★★★★☆  谷歌与Fervo签400MW地热协议，为AI数据中心供电</w:t>
-      </w:r>
-    </w:p>
-    <w:p>
-      <w:r>
-        <w:rPr>
-          <w:color w:val="888888"/>
-          <w:sz w:val="18"/>
-        </w:rPr>
-        <w:t>来源: TechCrunch</w:t>
-      </w:r>
-    </w:p>
-    <w:p>
-      <w:pPr>
-        <w:pStyle w:val="ListBullet"/>
-      </w:pPr>
-      <w:r>
-        <w:t>谷歌与Fervo Energy签署400兆瓦增强地热购电协议，未来可扩展至1吉瓦，足以为犹他州一个超大型AI数据中心供电。AI算力需求激增使云巨头争相锁定清洁稳定的电力来源。这一协议验证了增强地热技术在大规模商业化中的可行性。</w:t>
+        <w:t>谷歌与Fervo能源签署400MW增强型地热购电协议，并可扩展至1GW，足以为犹他州一个大型AI数据中心供电。这是增强型地热迄今收获的最大规模科技企业订单之一，表明AI浪潮正在推动清洁能源技术加速落地。</w:t>
       </w:r>
     </w:p>
     <w:p>
@@ -450,7 +412,7 @@
         <w:rPr>
           <w:sz w:val="24"/>
         </w:rPr>
-        <w:t>#10 ★★★★☆  中国自动驾驶强制国标发布，未来两年L3密集量产</w:t>
+        <w:t>#9 ★★★★☆  中国发布自动驾驶强制国标 L3级量产迎来提速</w:t>
       </w:r>
     </w:p>
     <w:p>
@@ -467,7 +429,7 @@
         <w:pStyle w:val="ListBullet"/>
       </w:pPr>
       <w:r>
-        <w:t>中国正式发布自动驾驶强制性国家标准，享界、智界等本土品牌已提前布局。业内预计未来两年L3级自动驾驶将密集进入量产阶段。该法规为行业提供了明确的技术方向和安全底线，标志着中国自动驾驶加速从辅助驾驶迈向规模化应用。</w:t>
+        <w:t>中国发布自动驾驶强制性国家标准，为L3级自动驾驶量产铺路。享界、智界等品牌已提前布局符合新规的技术，业内预计今明两年L3级功能将密集“上车”，智能驾驶的商业化与法规体系有望同步进入快车道。</w:t>
       </w:r>
     </w:p>
     <w:p>
@@ -477,6 +439,44 @@
           <w:sz w:val="18"/>
         </w:rPr>
         <w:t>https://www.ifanr.com/1677995</w:t>
+      </w:r>
+    </w:p>
+    <w:p/>
+    <w:p>
+      <w:pPr>
+        <w:pStyle w:val="Heading3"/>
+      </w:pPr>
+      <w:r>
+        <w:rPr>
+          <w:sz w:val="24"/>
+        </w:rPr>
+        <w:t>#10 ★★★☆☆  IBM发布Granite 4.2大模型 披露构建细节</w:t>
+      </w:r>
+    </w:p>
+    <w:p>
+      <w:r>
+        <w:rPr>
+          <w:color w:val="888888"/>
+          <w:sz w:val="18"/>
+        </w:rPr>
+        <w:t>来源: Hugging Face</w:t>
+      </w:r>
+    </w:p>
+    <w:p>
+      <w:pPr>
+        <w:pStyle w:val="ListBullet"/>
+      </w:pPr>
+      <w:r>
+        <w:t>IBM发布Granite 4.2系列大语言模型，并公开其架构、数据与训练细节。该系列针对企业级任务进行了效率和可靠性优化，支持更长上下文和工具调用。IBM希望借此巩固其在开源企业AI模型市场中的地位。</w:t>
+      </w:r>
+    </w:p>
+    <w:p>
+      <w:r>
+        <w:rPr>
+          <w:color w:val="3366CC"/>
+          <w:sz w:val="18"/>
+        </w:rPr>
+        <w:t>https://huggingface.co/blog/ibm-granite/granite-4-2</w:t>
       </w:r>
     </w:p>
     <w:p/>

</xml_diff>